<commit_message>
Activity feed — complete:
</commit_message>
<xml_diff>
--- a/Missing features_April 17, 2026.docx
+++ b/Missing features_April 17, 2026.docx
@@ -1655,6 +1655,53 @@
                     <a:xfrm>
                       <a:off x="0" y="0"/>
                       <a:ext cx="5943600" cy="5117465"/>
+                    </a:xfrm>
+                    <a:prstGeom prst="rect">
+                      <a:avLst/>
+                    </a:prstGeom>
+                  </pic:spPr>
+                </pic:pic>
+              </a:graphicData>
+            </a:graphic>
+          </wp:inline>
+        </w:drawing>
+      </w:r>
+    </w:p>
+    <w:p/>
+    <w:p>
+      <w:r>
+        <w:t>Promote account to admin</w:t>
+      </w:r>
+    </w:p>
+    <w:p/>
+    <w:p>
+      <w:r>
+        <w:lastRenderedPageBreak/>
+        <w:drawing>
+          <wp:inline distT="0" distB="0" distL="0" distR="0" wp14:anchorId="47479E99" wp14:editId="2D551B59">
+            <wp:extent cx="5943600" cy="3456305"/>
+            <wp:effectExtent l="0" t="0" r="0" b="0"/>
+            <wp:docPr id="1840606261" name="Picture 1"/>
+            <wp:cNvGraphicFramePr>
+              <a:graphicFrameLocks xmlns:a="http://schemas.openxmlformats.org/drawingml/2006/main" noChangeAspect="1"/>
+            </wp:cNvGraphicFramePr>
+            <a:graphic xmlns:a="http://schemas.openxmlformats.org/drawingml/2006/main">
+              <a:graphicData uri="http://schemas.openxmlformats.org/drawingml/2006/picture">
+                <pic:pic xmlns:pic="http://schemas.openxmlformats.org/drawingml/2006/picture">
+                  <pic:nvPicPr>
+                    <pic:cNvPr id="1840606261" name=""/>
+                    <pic:cNvPicPr/>
+                  </pic:nvPicPr>
+                  <pic:blipFill>
+                    <a:blip r:embed="rId7"/>
+                    <a:stretch>
+                      <a:fillRect/>
+                    </a:stretch>
+                  </pic:blipFill>
+                  <pic:spPr>
+                    <a:xfrm>
+                      <a:off x="0" y="0"/>
+                      <a:ext cx="5943600" cy="3456305"/>
                     </a:xfrm>
                     <a:prstGeom prst="rect">
                       <a:avLst/>

</xml_diff>

<commit_message>
Created email confirmation for new sign on
</commit_message>
<xml_diff>
--- a/Missing features_April 17, 2026.docx
+++ b/Missing features_April 17, 2026.docx
@@ -878,13 +878,22 @@
       </w:r>
     </w:p>
     <w:p>
+      <w:pPr>
+        <w:rPr>
+          <w:highlight w:val="green"/>
+        </w:rPr>
+      </w:pPr>
       <w:r>
         <w:rPr>
           <w:rFonts w:ascii="Segoe UI Emoji" w:hAnsi="Segoe UI Emoji" w:cs="Segoe UI Emoji"/>
+          <w:highlight w:val="green"/>
         </w:rPr>
         <w:t>👤</w:t>
       </w:r>
       <w:r>
+        <w:rPr>
+          <w:highlight w:val="green"/>
+        </w:rPr>
         <w:t xml:space="preserve"> User Experience</w:t>
       </w:r>
     </w:p>
@@ -894,15 +903,22 @@
           <w:ilvl w:val="0"/>
           <w:numId w:val="2"/>
         </w:numPr>
+        <w:rPr>
+          <w:highlight w:val="green"/>
+        </w:rPr>
       </w:pPr>
       <w:r>
         <w:rPr>
           <w:b/>
           <w:bCs/>
+          <w:highlight w:val="green"/>
         </w:rPr>
         <w:t>Onboarding flow</w:t>
       </w:r>
       <w:r>
+        <w:rPr>
+          <w:highlight w:val="green"/>
+        </w:rPr>
         <w:t> — welcome screen after signup, guide new users to post or browse</w:t>
       </w:r>
     </w:p>
@@ -912,15 +928,22 @@
           <w:ilvl w:val="0"/>
           <w:numId w:val="2"/>
         </w:numPr>
+        <w:rPr>
+          <w:highlight w:val="green"/>
+        </w:rPr>
       </w:pPr>
       <w:r>
         <w:rPr>
           <w:b/>
           <w:bCs/>
+          <w:highlight w:val="green"/>
         </w:rPr>
         <w:t>User settings page</w:t>
       </w:r>
       <w:r>
+        <w:rPr>
+          <w:highlight w:val="green"/>
+        </w:rPr>
         <w:t> — change password, email, language, notification preferences</w:t>
       </w:r>
     </w:p>
@@ -930,15 +953,22 @@
           <w:ilvl w:val="0"/>
           <w:numId w:val="2"/>
         </w:numPr>
+        <w:rPr>
+          <w:highlight w:val="green"/>
+        </w:rPr>
       </w:pPr>
       <w:r>
         <w:rPr>
           <w:b/>
           <w:bCs/>
+          <w:highlight w:val="green"/>
         </w:rPr>
         <w:t>Activity feed</w:t>
       </w:r>
       <w:r>
+        <w:rPr>
+          <w:highlight w:val="green"/>
+        </w:rPr>
         <w:t> — personalised home feed based on your groups, bookmarks, and location</w:t>
       </w:r>
     </w:p>
@@ -948,15 +978,22 @@
           <w:ilvl w:val="0"/>
           <w:numId w:val="2"/>
         </w:numPr>
+        <w:rPr>
+          <w:highlight w:val="green"/>
+        </w:rPr>
       </w:pPr>
       <w:r>
         <w:rPr>
           <w:b/>
           <w:bCs/>
+          <w:highlight w:val="green"/>
         </w:rPr>
         <w:t>Dark mode</w:t>
       </w:r>
       <w:r>
+        <w:rPr>
+          <w:highlight w:val="green"/>
+        </w:rPr>
         <w:t> — toggle between light and dark themes</w:t>
       </w:r>
     </w:p>
@@ -1667,8 +1704,10 @@
         </w:drawing>
       </w:r>
     </w:p>
-    <w:p/>
-    <w:p>
+    <w:p>
+      <w:pPr>
+        <w:pStyle w:val="Heading1"/>
+      </w:pPr>
       <w:r>
         <w:t>Promote account to admin</w:t>
       </w:r>
@@ -1714,6 +1753,215 @@
         </w:drawing>
       </w:r>
     </w:p>
+    <w:p/>
+    <w:p/>
+    <w:p>
+      <w:pPr>
+        <w:pStyle w:val="Heading1"/>
+      </w:pPr>
+      <w:r>
+        <w:t>NOTES</w:t>
+      </w:r>
+    </w:p>
+    <w:p>
+      <w:r>
+        <w:t>You're welcome! Here's a quick summary of what we accomplished today:</w:t>
+      </w:r>
+    </w:p>
+    <w:p>
+      <w:pPr>
+        <w:numPr>
+          <w:ilvl w:val="0"/>
+          <w:numId w:val="10"/>
+        </w:numPr>
+      </w:pPr>
+      <w:r>
+        <w:t>Published the code to </w:t>
+      </w:r>
+      <w:r>
+        <w:rPr>
+          <w:b/>
+          <w:bCs/>
+        </w:rPr>
+        <w:t>GitHub</w:t>
+      </w:r>
+      <w:r>
+        <w:t> (eagyeibo/hivecollective)</w:t>
+      </w:r>
+    </w:p>
+    <w:p>
+      <w:pPr>
+        <w:numPr>
+          <w:ilvl w:val="0"/>
+          <w:numId w:val="10"/>
+        </w:numPr>
+      </w:pPr>
+      <w:r>
+        <w:t>Connected </w:t>
+      </w:r>
+      <w:r>
+        <w:rPr>
+          <w:b/>
+          <w:bCs/>
+        </w:rPr>
+        <w:t>Vercel</w:t>
+      </w:r>
+      <w:r>
+        <w:t> (frontend) and </w:t>
+      </w:r>
+      <w:r>
+        <w:rPr>
+          <w:b/>
+          <w:bCs/>
+        </w:rPr>
+        <w:t>Railway</w:t>
+      </w:r>
+      <w:r>
+        <w:t> (backend) to the new repo</w:t>
+      </w:r>
+    </w:p>
+    <w:p>
+      <w:pPr>
+        <w:numPr>
+          <w:ilvl w:val="0"/>
+          <w:numId w:val="10"/>
+        </w:numPr>
+      </w:pPr>
+      <w:r>
+        <w:t>Migrated the production database with all the new tables and columns</w:t>
+      </w:r>
+    </w:p>
+    <w:p>
+      <w:pPr>
+        <w:numPr>
+          <w:ilvl w:val="0"/>
+          <w:numId w:val="10"/>
+        </w:numPr>
+      </w:pPr>
+      <w:r>
+        <w:t>Set up deploy.bat so future updates are just one double-click away</w:t>
+      </w:r>
+    </w:p>
+    <w:p>
+      <w:r>
+        <w:t>Whenever you make changes locally, just run deploy.bat, type a commit message, and the live site updates automatically. Good luck with HiveCollective!</w:t>
+      </w:r>
+    </w:p>
+    <w:p/>
+    <w:p>
+      <w:pPr>
+        <w:pStyle w:val="Heading1"/>
+        <w:rPr>
+          <w:rStyle w:val="Heading1Char"/>
+        </w:rPr>
+      </w:pPr>
+      <w:r>
+        <w:rPr>
+          <w:rStyle w:val="Heading1Char"/>
+        </w:rPr>
+        <w:t>password reset activation + email verification </w:t>
+      </w:r>
+    </w:p>
+    <w:p>
+      <w:r>
+        <w:t>Which email provider do you have/want to use?</w:t>
+      </w:r>
+    </w:p>
+    <w:p>
+      <w:pPr>
+        <w:numPr>
+          <w:ilvl w:val="0"/>
+          <w:numId w:val="11"/>
+        </w:numPr>
+      </w:pPr>
+      <w:r>
+        <w:rPr>
+          <w:b/>
+          <w:bCs/>
+        </w:rPr>
+        <w:t>Resend</w:t>
+      </w:r>
+      <w:r>
+        <w:t> — easiest, free tier (3,000 emails/month), just an API key</w:t>
+      </w:r>
+    </w:p>
+    <w:p>
+      <w:pPr>
+        <w:numPr>
+          <w:ilvl w:val="0"/>
+          <w:numId w:val="11"/>
+        </w:numPr>
+      </w:pPr>
+      <w:r>
+        <w:rPr>
+          <w:b/>
+          <w:bCs/>
+        </w:rPr>
+        <w:t>Gmail SMTP</w:t>
+      </w:r>
+      <w:r>
+        <w:t> — free if you have a Gmail account, needs an app password</w:t>
+      </w:r>
+    </w:p>
+    <w:p>
+      <w:pPr>
+        <w:numPr>
+          <w:ilvl w:val="0"/>
+          <w:numId w:val="11"/>
+        </w:numPr>
+      </w:pPr>
+      <w:r>
+        <w:rPr>
+          <w:b/>
+          <w:bCs/>
+        </w:rPr>
+        <w:lastRenderedPageBreak/>
+        <w:t>SendGrid</w:t>
+      </w:r>
+      <w:r>
+        <w:t> — more enterprise, free up to 100/day</w:t>
+      </w:r>
+    </w:p>
+    <w:p/>
+    <w:p>
+      <w:r>
+        <w:drawing>
+          <wp:inline distT="0" distB="0" distL="0" distR="0" wp14:anchorId="6F642634" wp14:editId="2CDEE8A8">
+            <wp:extent cx="5943600" cy="4577715"/>
+            <wp:effectExtent l="0" t="0" r="0" b="0"/>
+            <wp:docPr id="587886526" name="Picture 1"/>
+            <wp:cNvGraphicFramePr>
+              <a:graphicFrameLocks xmlns:a="http://schemas.openxmlformats.org/drawingml/2006/main" noChangeAspect="1"/>
+            </wp:cNvGraphicFramePr>
+            <a:graphic xmlns:a="http://schemas.openxmlformats.org/drawingml/2006/main">
+              <a:graphicData uri="http://schemas.openxmlformats.org/drawingml/2006/picture">
+                <pic:pic xmlns:pic="http://schemas.openxmlformats.org/drawingml/2006/picture">
+                  <pic:nvPicPr>
+                    <pic:cNvPr id="587886526" name=""/>
+                    <pic:cNvPicPr/>
+                  </pic:nvPicPr>
+                  <pic:blipFill>
+                    <a:blip r:embed="rId8"/>
+                    <a:stretch>
+                      <a:fillRect/>
+                    </a:stretch>
+                  </pic:blipFill>
+                  <pic:spPr>
+                    <a:xfrm>
+                      <a:off x="0" y="0"/>
+                      <a:ext cx="5943600" cy="4577715"/>
+                    </a:xfrm>
+                    <a:prstGeom prst="rect">
+                      <a:avLst/>
+                    </a:prstGeom>
+                  </pic:spPr>
+                </pic:pic>
+              </a:graphicData>
+            </a:graphic>
+          </wp:inline>
+        </w:drawing>
+      </w:r>
+    </w:p>
     <w:sectPr>
       <w:pgSz w:w="12240" w:h="15840"/>
       <w:pgMar w:top="1440" w:right="1440" w:bottom="1440" w:left="1440" w:header="708" w:footer="708" w:gutter="0"/>
@@ -2174,6 +2422,155 @@
     </w:lvl>
   </w:abstractNum>
   <w:abstractNum w:abstractNumId="3" w15:restartNumberingAfterBreak="0">
+    <w:nsid w:val="270F1437"/>
+    <w:multiLevelType w:val="multilevel"/>
+    <w:tmpl w:val="48B4844C"/>
+    <w:lvl w:ilvl="0">
+      <w:start w:val="1"/>
+      <w:numFmt w:val="bullet"/>
+      <w:lvlText w:val=""/>
+      <w:lvlJc w:val="left"/>
+      <w:pPr>
+        <w:tabs>
+          <w:tab w:val="num" w:pos="720"/>
+        </w:tabs>
+        <w:ind w:left="720" w:hanging="360"/>
+      </w:pPr>
+      <w:rPr>
+        <w:rFonts w:ascii="Symbol" w:hAnsi="Symbol" w:hint="default"/>
+        <w:sz w:val="20"/>
+      </w:rPr>
+    </w:lvl>
+    <w:lvl w:ilvl="1" w:tentative="1">
+      <w:start w:val="1"/>
+      <w:numFmt w:val="bullet"/>
+      <w:lvlText w:val=""/>
+      <w:lvlJc w:val="left"/>
+      <w:pPr>
+        <w:tabs>
+          <w:tab w:val="num" w:pos="1440"/>
+        </w:tabs>
+        <w:ind w:left="1440" w:hanging="360"/>
+      </w:pPr>
+      <w:rPr>
+        <w:rFonts w:ascii="Symbol" w:hAnsi="Symbol" w:hint="default"/>
+        <w:sz w:val="20"/>
+      </w:rPr>
+    </w:lvl>
+    <w:lvl w:ilvl="2" w:tentative="1">
+      <w:start w:val="1"/>
+      <w:numFmt w:val="bullet"/>
+      <w:lvlText w:val=""/>
+      <w:lvlJc w:val="left"/>
+      <w:pPr>
+        <w:tabs>
+          <w:tab w:val="num" w:pos="2160"/>
+        </w:tabs>
+        <w:ind w:left="2160" w:hanging="360"/>
+      </w:pPr>
+      <w:rPr>
+        <w:rFonts w:ascii="Symbol" w:hAnsi="Symbol" w:hint="default"/>
+        <w:sz w:val="20"/>
+      </w:rPr>
+    </w:lvl>
+    <w:lvl w:ilvl="3" w:tentative="1">
+      <w:start w:val="1"/>
+      <w:numFmt w:val="bullet"/>
+      <w:lvlText w:val=""/>
+      <w:lvlJc w:val="left"/>
+      <w:pPr>
+        <w:tabs>
+          <w:tab w:val="num" w:pos="2880"/>
+        </w:tabs>
+        <w:ind w:left="2880" w:hanging="360"/>
+      </w:pPr>
+      <w:rPr>
+        <w:rFonts w:ascii="Symbol" w:hAnsi="Symbol" w:hint="default"/>
+        <w:sz w:val="20"/>
+      </w:rPr>
+    </w:lvl>
+    <w:lvl w:ilvl="4" w:tentative="1">
+      <w:start w:val="1"/>
+      <w:numFmt w:val="bullet"/>
+      <w:lvlText w:val=""/>
+      <w:lvlJc w:val="left"/>
+      <w:pPr>
+        <w:tabs>
+          <w:tab w:val="num" w:pos="3600"/>
+        </w:tabs>
+        <w:ind w:left="3600" w:hanging="360"/>
+      </w:pPr>
+      <w:rPr>
+        <w:rFonts w:ascii="Symbol" w:hAnsi="Symbol" w:hint="default"/>
+        <w:sz w:val="20"/>
+      </w:rPr>
+    </w:lvl>
+    <w:lvl w:ilvl="5" w:tentative="1">
+      <w:start w:val="1"/>
+      <w:numFmt w:val="bullet"/>
+      <w:lvlText w:val=""/>
+      <w:lvlJc w:val="left"/>
+      <w:pPr>
+        <w:tabs>
+          <w:tab w:val="num" w:pos="4320"/>
+        </w:tabs>
+        <w:ind w:left="4320" w:hanging="360"/>
+      </w:pPr>
+      <w:rPr>
+        <w:rFonts w:ascii="Symbol" w:hAnsi="Symbol" w:hint="default"/>
+        <w:sz w:val="20"/>
+      </w:rPr>
+    </w:lvl>
+    <w:lvl w:ilvl="6" w:tentative="1">
+      <w:start w:val="1"/>
+      <w:numFmt w:val="bullet"/>
+      <w:lvlText w:val=""/>
+      <w:lvlJc w:val="left"/>
+      <w:pPr>
+        <w:tabs>
+          <w:tab w:val="num" w:pos="5040"/>
+        </w:tabs>
+        <w:ind w:left="5040" w:hanging="360"/>
+      </w:pPr>
+      <w:rPr>
+        <w:rFonts w:ascii="Symbol" w:hAnsi="Symbol" w:hint="default"/>
+        <w:sz w:val="20"/>
+      </w:rPr>
+    </w:lvl>
+    <w:lvl w:ilvl="7" w:tentative="1">
+      <w:start w:val="1"/>
+      <w:numFmt w:val="bullet"/>
+      <w:lvlText w:val=""/>
+      <w:lvlJc w:val="left"/>
+      <w:pPr>
+        <w:tabs>
+          <w:tab w:val="num" w:pos="5760"/>
+        </w:tabs>
+        <w:ind w:left="5760" w:hanging="360"/>
+      </w:pPr>
+      <w:rPr>
+        <w:rFonts w:ascii="Symbol" w:hAnsi="Symbol" w:hint="default"/>
+        <w:sz w:val="20"/>
+      </w:rPr>
+    </w:lvl>
+    <w:lvl w:ilvl="8" w:tentative="1">
+      <w:start w:val="1"/>
+      <w:numFmt w:val="bullet"/>
+      <w:lvlText w:val=""/>
+      <w:lvlJc w:val="left"/>
+      <w:pPr>
+        <w:tabs>
+          <w:tab w:val="num" w:pos="6480"/>
+        </w:tabs>
+        <w:ind w:left="6480" w:hanging="360"/>
+      </w:pPr>
+      <w:rPr>
+        <w:rFonts w:ascii="Symbol" w:hAnsi="Symbol" w:hint="default"/>
+        <w:sz w:val="20"/>
+      </w:rPr>
+    </w:lvl>
+  </w:abstractNum>
+  <w:abstractNum w:abstractNumId="4" w15:restartNumberingAfterBreak="0">
     <w:nsid w:val="279654AB"/>
     <w:multiLevelType w:val="multilevel"/>
     <w:tmpl w:val="E35027DE"/>
@@ -2322,7 +2719,7 @@
       </w:rPr>
     </w:lvl>
   </w:abstractNum>
-  <w:abstractNum w:abstractNumId="4" w15:restartNumberingAfterBreak="0">
+  <w:abstractNum w:abstractNumId="5" w15:restartNumberingAfterBreak="0">
     <w:nsid w:val="339E76E0"/>
     <w:multiLevelType w:val="multilevel"/>
     <w:tmpl w:val="7A6C1F74"/>
@@ -2471,7 +2868,7 @@
       </w:rPr>
     </w:lvl>
   </w:abstractNum>
-  <w:abstractNum w:abstractNumId="5" w15:restartNumberingAfterBreak="0">
+  <w:abstractNum w:abstractNumId="6" w15:restartNumberingAfterBreak="0">
     <w:nsid w:val="415F1F55"/>
     <w:multiLevelType w:val="multilevel"/>
     <w:tmpl w:val="63121346"/>
@@ -2620,7 +3017,7 @@
       </w:rPr>
     </w:lvl>
   </w:abstractNum>
-  <w:abstractNum w:abstractNumId="6" w15:restartNumberingAfterBreak="0">
+  <w:abstractNum w:abstractNumId="7" w15:restartNumberingAfterBreak="0">
     <w:nsid w:val="4F45546C"/>
     <w:multiLevelType w:val="multilevel"/>
     <w:tmpl w:val="CF4C564A"/>
@@ -2769,7 +3166,156 @@
       </w:rPr>
     </w:lvl>
   </w:abstractNum>
-  <w:abstractNum w:abstractNumId="7" w15:restartNumberingAfterBreak="0">
+  <w:abstractNum w:abstractNumId="8" w15:restartNumberingAfterBreak="0">
+    <w:nsid w:val="63186A27"/>
+    <w:multiLevelType w:val="multilevel"/>
+    <w:tmpl w:val="69CC1366"/>
+    <w:lvl w:ilvl="0">
+      <w:start w:val="1"/>
+      <w:numFmt w:val="bullet"/>
+      <w:lvlText w:val=""/>
+      <w:lvlJc w:val="left"/>
+      <w:pPr>
+        <w:tabs>
+          <w:tab w:val="num" w:pos="720"/>
+        </w:tabs>
+        <w:ind w:left="720" w:hanging="360"/>
+      </w:pPr>
+      <w:rPr>
+        <w:rFonts w:ascii="Symbol" w:hAnsi="Symbol" w:hint="default"/>
+        <w:sz w:val="20"/>
+      </w:rPr>
+    </w:lvl>
+    <w:lvl w:ilvl="1" w:tentative="1">
+      <w:start w:val="1"/>
+      <w:numFmt w:val="bullet"/>
+      <w:lvlText w:val=""/>
+      <w:lvlJc w:val="left"/>
+      <w:pPr>
+        <w:tabs>
+          <w:tab w:val="num" w:pos="1440"/>
+        </w:tabs>
+        <w:ind w:left="1440" w:hanging="360"/>
+      </w:pPr>
+      <w:rPr>
+        <w:rFonts w:ascii="Symbol" w:hAnsi="Symbol" w:hint="default"/>
+        <w:sz w:val="20"/>
+      </w:rPr>
+    </w:lvl>
+    <w:lvl w:ilvl="2" w:tentative="1">
+      <w:start w:val="1"/>
+      <w:numFmt w:val="bullet"/>
+      <w:lvlText w:val=""/>
+      <w:lvlJc w:val="left"/>
+      <w:pPr>
+        <w:tabs>
+          <w:tab w:val="num" w:pos="2160"/>
+        </w:tabs>
+        <w:ind w:left="2160" w:hanging="360"/>
+      </w:pPr>
+      <w:rPr>
+        <w:rFonts w:ascii="Symbol" w:hAnsi="Symbol" w:hint="default"/>
+        <w:sz w:val="20"/>
+      </w:rPr>
+    </w:lvl>
+    <w:lvl w:ilvl="3" w:tentative="1">
+      <w:start w:val="1"/>
+      <w:numFmt w:val="bullet"/>
+      <w:lvlText w:val=""/>
+      <w:lvlJc w:val="left"/>
+      <w:pPr>
+        <w:tabs>
+          <w:tab w:val="num" w:pos="2880"/>
+        </w:tabs>
+        <w:ind w:left="2880" w:hanging="360"/>
+      </w:pPr>
+      <w:rPr>
+        <w:rFonts w:ascii="Symbol" w:hAnsi="Symbol" w:hint="default"/>
+        <w:sz w:val="20"/>
+      </w:rPr>
+    </w:lvl>
+    <w:lvl w:ilvl="4" w:tentative="1">
+      <w:start w:val="1"/>
+      <w:numFmt w:val="bullet"/>
+      <w:lvlText w:val=""/>
+      <w:lvlJc w:val="left"/>
+      <w:pPr>
+        <w:tabs>
+          <w:tab w:val="num" w:pos="3600"/>
+        </w:tabs>
+        <w:ind w:left="3600" w:hanging="360"/>
+      </w:pPr>
+      <w:rPr>
+        <w:rFonts w:ascii="Symbol" w:hAnsi="Symbol" w:hint="default"/>
+        <w:sz w:val="20"/>
+      </w:rPr>
+    </w:lvl>
+    <w:lvl w:ilvl="5" w:tentative="1">
+      <w:start w:val="1"/>
+      <w:numFmt w:val="bullet"/>
+      <w:lvlText w:val=""/>
+      <w:lvlJc w:val="left"/>
+      <w:pPr>
+        <w:tabs>
+          <w:tab w:val="num" w:pos="4320"/>
+        </w:tabs>
+        <w:ind w:left="4320" w:hanging="360"/>
+      </w:pPr>
+      <w:rPr>
+        <w:rFonts w:ascii="Symbol" w:hAnsi="Symbol" w:hint="default"/>
+        <w:sz w:val="20"/>
+      </w:rPr>
+    </w:lvl>
+    <w:lvl w:ilvl="6" w:tentative="1">
+      <w:start w:val="1"/>
+      <w:numFmt w:val="bullet"/>
+      <w:lvlText w:val=""/>
+      <w:lvlJc w:val="left"/>
+      <w:pPr>
+        <w:tabs>
+          <w:tab w:val="num" w:pos="5040"/>
+        </w:tabs>
+        <w:ind w:left="5040" w:hanging="360"/>
+      </w:pPr>
+      <w:rPr>
+        <w:rFonts w:ascii="Symbol" w:hAnsi="Symbol" w:hint="default"/>
+        <w:sz w:val="20"/>
+      </w:rPr>
+    </w:lvl>
+    <w:lvl w:ilvl="7" w:tentative="1">
+      <w:start w:val="1"/>
+      <w:numFmt w:val="bullet"/>
+      <w:lvlText w:val=""/>
+      <w:lvlJc w:val="left"/>
+      <w:pPr>
+        <w:tabs>
+          <w:tab w:val="num" w:pos="5760"/>
+        </w:tabs>
+        <w:ind w:left="5760" w:hanging="360"/>
+      </w:pPr>
+      <w:rPr>
+        <w:rFonts w:ascii="Symbol" w:hAnsi="Symbol" w:hint="default"/>
+        <w:sz w:val="20"/>
+      </w:rPr>
+    </w:lvl>
+    <w:lvl w:ilvl="8" w:tentative="1">
+      <w:start w:val="1"/>
+      <w:numFmt w:val="bullet"/>
+      <w:lvlText w:val=""/>
+      <w:lvlJc w:val="left"/>
+      <w:pPr>
+        <w:tabs>
+          <w:tab w:val="num" w:pos="6480"/>
+        </w:tabs>
+        <w:ind w:left="6480" w:hanging="360"/>
+      </w:pPr>
+      <w:rPr>
+        <w:rFonts w:ascii="Symbol" w:hAnsi="Symbol" w:hint="default"/>
+        <w:sz w:val="20"/>
+      </w:rPr>
+    </w:lvl>
+  </w:abstractNum>
+  <w:abstractNum w:abstractNumId="9" w15:restartNumberingAfterBreak="0">
     <w:nsid w:val="68C93894"/>
     <w:multiLevelType w:val="multilevel"/>
     <w:tmpl w:val="ADFC5036"/>
@@ -2918,7 +3464,7 @@
       </w:rPr>
     </w:lvl>
   </w:abstractNum>
-  <w:abstractNum w:abstractNumId="8" w15:restartNumberingAfterBreak="0">
+  <w:abstractNum w:abstractNumId="10" w15:restartNumberingAfterBreak="0">
     <w:nsid w:val="6C540EEC"/>
     <w:multiLevelType w:val="multilevel"/>
     <w:tmpl w:val="58E605E4"/>
@@ -3068,31 +3614,37 @@
     </w:lvl>
   </w:abstractNum>
   <w:num w:numId="1" w16cid:durableId="1773428491">
-    <w:abstractNumId w:val="5"/>
+    <w:abstractNumId w:val="6"/>
   </w:num>
   <w:num w:numId="2" w16cid:durableId="1055592654">
-    <w:abstractNumId w:val="8"/>
+    <w:abstractNumId w:val="10"/>
   </w:num>
   <w:num w:numId="3" w16cid:durableId="1162086700">
-    <w:abstractNumId w:val="7"/>
+    <w:abstractNumId w:val="9"/>
   </w:num>
   <w:num w:numId="4" w16cid:durableId="1057969502">
     <w:abstractNumId w:val="2"/>
   </w:num>
   <w:num w:numId="5" w16cid:durableId="162136220">
-    <w:abstractNumId w:val="4"/>
+    <w:abstractNumId w:val="5"/>
   </w:num>
   <w:num w:numId="6" w16cid:durableId="8604171">
     <w:abstractNumId w:val="1"/>
   </w:num>
   <w:num w:numId="7" w16cid:durableId="1732384695">
-    <w:abstractNumId w:val="6"/>
+    <w:abstractNumId w:val="7"/>
   </w:num>
   <w:num w:numId="8" w16cid:durableId="187837176">
     <w:abstractNumId w:val="0"/>
   </w:num>
   <w:num w:numId="9" w16cid:durableId="1886944262">
+    <w:abstractNumId w:val="4"/>
+  </w:num>
+  <w:num w:numId="10" w16cid:durableId="2050838095">
     <w:abstractNumId w:val="3"/>
+  </w:num>
+  <w:num w:numId="11" w16cid:durableId="1470317072">
+    <w:abstractNumId w:val="8"/>
   </w:num>
 </w:numbering>
 </file>
@@ -3700,7 +4252,6 @@
   <w:style w:type="character" w:default="1" w:styleId="DefaultParagraphFont">
     <w:name w:val="Default Paragraph Font"/>
     <w:uiPriority w:val="1"/>
-    <w:semiHidden/>
     <w:unhideWhenUsed/>
   </w:style>
   <w:style w:type="table" w:default="1" w:styleId="TableNormal">

</xml_diff>

<commit_message>
Implemented email confirmation with Resend.com
</commit_message>
<xml_diff>
--- a/Missing features_April 17, 2026.docx
+++ b/Missing features_April 17, 2026.docx
@@ -1625,6 +1625,9 @@
     <w:p/>
     <w:p>
       <w:r>
+        <w:rPr>
+          <w:noProof/>
+        </w:rPr>
         <w:lastRenderedPageBreak/>
         <w:drawing>
           <wp:inline distT="0" distB="0" distL="0" distR="0" wp14:anchorId="1697364B" wp14:editId="0546BD20">
@@ -1666,6 +1669,9 @@
     <w:p/>
     <w:p>
       <w:r>
+        <w:rPr>
+          <w:noProof/>
+        </w:rPr>
         <w:lastRenderedPageBreak/>
         <w:drawing>
           <wp:inline distT="0" distB="0" distL="0" distR="0" wp14:anchorId="1EE74E9A" wp14:editId="71568C47">
@@ -1715,6 +1721,9 @@
     <w:p/>
     <w:p>
       <w:r>
+        <w:rPr>
+          <w:noProof/>
+        </w:rPr>
         <w:lastRenderedPageBreak/>
         <w:drawing>
           <wp:inline distT="0" distB="0" distL="0" distR="0" wp14:anchorId="47479E99" wp14:editId="2D551B59">
@@ -1923,13 +1932,14 @@
       </w:r>
     </w:p>
     <w:p/>
+    <w:p/>
     <w:p>
       <w:r>
         <w:drawing>
-          <wp:inline distT="0" distB="0" distL="0" distR="0" wp14:anchorId="6F642634" wp14:editId="2CDEE8A8">
-            <wp:extent cx="5943600" cy="4577715"/>
-            <wp:effectExtent l="0" t="0" r="0" b="0"/>
-            <wp:docPr id="587886526" name="Picture 1"/>
+          <wp:inline distT="0" distB="0" distL="0" distR="0" wp14:anchorId="6CE93E6A" wp14:editId="54D4D7AE">
+            <wp:extent cx="4701663" cy="4053677"/>
+            <wp:effectExtent l="0" t="0" r="3810" b="4445"/>
+            <wp:docPr id="93223791" name="Picture 1"/>
             <wp:cNvGraphicFramePr>
               <a:graphicFrameLocks xmlns:a="http://schemas.openxmlformats.org/drawingml/2006/main" noChangeAspect="1"/>
             </wp:cNvGraphicFramePr>
@@ -1937,7 +1947,7 @@
               <a:graphicData uri="http://schemas.openxmlformats.org/drawingml/2006/picture">
                 <pic:pic xmlns:pic="http://schemas.openxmlformats.org/drawingml/2006/picture">
                   <pic:nvPicPr>
-                    <pic:cNvPr id="587886526" name=""/>
+                    <pic:cNvPr id="93223791" name=""/>
                     <pic:cNvPicPr/>
                   </pic:nvPicPr>
                   <pic:blipFill>
@@ -1949,7 +1959,7 @@
                   <pic:spPr>
                     <a:xfrm>
                       <a:off x="0" y="0"/>
-                      <a:ext cx="5943600" cy="4577715"/>
+                      <a:ext cx="4712909" cy="4063373"/>
                     </a:xfrm>
                     <a:prstGeom prst="rect">
                       <a:avLst/>
@@ -1960,6 +1970,67 @@
             </a:graphic>
           </wp:inline>
         </w:drawing>
+      </w:r>
+    </w:p>
+    <w:p/>
+    <w:p>
+      <w:r>
+        <w:lastRenderedPageBreak/>
+        <w:drawing>
+          <wp:inline distT="0" distB="0" distL="0" distR="0" wp14:anchorId="2310772E" wp14:editId="49B8F74D">
+            <wp:extent cx="4944165" cy="2991267"/>
+            <wp:effectExtent l="0" t="0" r="8890" b="0"/>
+            <wp:docPr id="1698846571" name="Picture 1"/>
+            <wp:cNvGraphicFramePr>
+              <a:graphicFrameLocks xmlns:a="http://schemas.openxmlformats.org/drawingml/2006/main" noChangeAspect="1"/>
+            </wp:cNvGraphicFramePr>
+            <a:graphic xmlns:a="http://schemas.openxmlformats.org/drawingml/2006/main">
+              <a:graphicData uri="http://schemas.openxmlformats.org/drawingml/2006/picture">
+                <pic:pic xmlns:pic="http://schemas.openxmlformats.org/drawingml/2006/picture">
+                  <pic:nvPicPr>
+                    <pic:cNvPr id="1698846571" name=""/>
+                    <pic:cNvPicPr/>
+                  </pic:nvPicPr>
+                  <pic:blipFill>
+                    <a:blip r:embed="rId9"/>
+                    <a:stretch>
+                      <a:fillRect/>
+                    </a:stretch>
+                  </pic:blipFill>
+                  <pic:spPr>
+                    <a:xfrm>
+                      <a:off x="0" y="0"/>
+                      <a:ext cx="4944165" cy="2991267"/>
+                    </a:xfrm>
+                    <a:prstGeom prst="rect">
+                      <a:avLst/>
+                    </a:prstGeom>
+                  </pic:spPr>
+                </pic:pic>
+              </a:graphicData>
+            </a:graphic>
+          </wp:inline>
+        </w:drawing>
+      </w:r>
+    </w:p>
+    <w:p/>
+    <w:p>
+      <w:r>
+        <w:t>EMAIL SENDING</w:t>
+      </w:r>
+    </w:p>
+    <w:p>
+      <w:r>
+        <w:t>Send.com</w:t>
+      </w:r>
+    </w:p>
+    <w:p/>
+    <w:p>
+      <w:r>
+        <w:t xml:space="preserve">API Key: </w:t>
+      </w:r>
+      <w:r>
+        <w:t>re_D3RQJAEE_Hf56BkcPEvqx4EXMQjm3KocL</w:t>
       </w:r>
     </w:p>
     <w:sectPr>
@@ -4252,6 +4323,7 @@
   <w:style w:type="character" w:default="1" w:styleId="DefaultParagraphFont">
     <w:name w:val="Default Paragraph Font"/>
     <w:uiPriority w:val="1"/>
+    <w:semiHidden/>
     <w:unhideWhenUsed/>
   </w:style>
   <w:style w:type="table" w:default="1" w:styleId="TableNormal">

</xml_diff>

<commit_message>
Completed email notification.  email notifications for comments, solutions, and @mentions will all go through Resend once deployed.
</commit_message>
<xml_diff>
--- a/Missing features_April 17, 2026.docx
+++ b/Missing features_April 17, 2026.docx
@@ -369,8 +369,13 @@
             <w:hideMark/>
           </w:tcPr>
           <w:p>
+            <w:proofErr w:type="spellStart"/>
             <w:r>
-              <w:t>OpenGraph meta tags (WhatsApp/Twitter link previews)</w:t>
+              <w:t>OpenGraph</w:t>
+            </w:r>
+            <w:proofErr w:type="spellEnd"/>
+            <w:r>
+              <w:t xml:space="preserve"> meta tags (WhatsApp/Twitter link previews)</w:t>
             </w:r>
           </w:p>
         </w:tc>
@@ -540,8 +545,21 @@
             <w:hideMark/>
           </w:tcPr>
           <w:p>
+            <w:proofErr w:type="spellStart"/>
             <w:r>
-              <w:t>ProfilePage not routed (also missing from App.jsx)</w:t>
+              <w:t>ProfilePage</w:t>
+            </w:r>
+            <w:proofErr w:type="spellEnd"/>
+            <w:r>
+              <w:t xml:space="preserve"> not routed (also missing from </w:t>
+            </w:r>
+            <w:proofErr w:type="spellStart"/>
+            <w:r>
+              <w:t>App.jsx</w:t>
+            </w:r>
+            <w:proofErr w:type="spellEnd"/>
+            <w:r>
+              <w:t>)</w:t>
             </w:r>
           </w:p>
         </w:tc>
@@ -779,7 +797,15 @@
     <w:p/>
     <w:p>
       <w:r>
-        <w:t>Based on what's already built, here's what would take HiveCollective to a professional level:</w:t>
+        <w:t xml:space="preserve">Based on what's already built, here's what would take </w:t>
+      </w:r>
+      <w:proofErr w:type="spellStart"/>
+      <w:r>
+        <w:t>HiveCollective</w:t>
+      </w:r>
+      <w:proofErr w:type="spellEnd"/>
+      <w:r>
+        <w:t xml:space="preserve"> to a professional level:</w:t>
       </w:r>
     </w:p>
     <w:p>
@@ -1243,10 +1269,34 @@
           <w:b/>
           <w:bCs/>
         </w:rPr>
-        <w:t>Shareable embed cards</w:t>
-      </w:r>
-      <w:r>
-        <w:t> — OpenGraph cards so links look good on WhatsApp/Twitter</w:t>
+        <w:t xml:space="preserve">Shareable </w:t>
+      </w:r>
+      <w:proofErr w:type="gramStart"/>
+      <w:r>
+        <w:rPr>
+          <w:b/>
+          <w:bCs/>
+        </w:rPr>
+        <w:t>embed</w:t>
+      </w:r>
+      <w:proofErr w:type="gramEnd"/>
+      <w:r>
+        <w:rPr>
+          <w:b/>
+          <w:bCs/>
+        </w:rPr>
+        <w:t xml:space="preserve"> cards</w:t>
+      </w:r>
+      <w:r>
+        <w:t xml:space="preserve"> — </w:t>
+      </w:r>
+      <w:proofErr w:type="spellStart"/>
+      <w:r>
+        <w:t>OpenGraph</w:t>
+      </w:r>
+      <w:proofErr w:type="spellEnd"/>
+      <w:r>
+        <w:t xml:space="preserve"> cards so links look good on WhatsApp/Twitter</w:t>
       </w:r>
     </w:p>
     <w:p>
@@ -1795,7 +1845,23 @@
         <w:t>GitHub</w:t>
       </w:r>
       <w:r>
-        <w:t> (eagyeibo/hivecollective)</w:t>
+        <w:t> (</w:t>
+      </w:r>
+      <w:proofErr w:type="spellStart"/>
+      <w:r>
+        <w:t>eagyeibo</w:t>
+      </w:r>
+      <w:proofErr w:type="spellEnd"/>
+      <w:r>
+        <w:t>/</w:t>
+      </w:r>
+      <w:proofErr w:type="spellStart"/>
+      <w:r>
+        <w:t>hivecollective</w:t>
+      </w:r>
+      <w:proofErr w:type="spellEnd"/>
+      <w:r>
+        <w:t>)</w:t>
       </w:r>
     </w:p>
     <w:p>
@@ -1808,6 +1874,7 @@
       <w:r>
         <w:t>Connected </w:t>
       </w:r>
+      <w:proofErr w:type="spellStart"/>
       <w:r>
         <w:rPr>
           <w:b/>
@@ -1815,6 +1882,7 @@
         </w:rPr>
         <w:t>Vercel</w:t>
       </w:r>
+      <w:proofErr w:type="spellEnd"/>
       <w:r>
         <w:t> (frontend) and </w:t>
       </w:r>
@@ -1853,7 +1921,15 @@
     </w:p>
     <w:p>
       <w:r>
-        <w:t>Whenever you make changes locally, just run deploy.bat, type a commit message, and the live site updates automatically. Good luck with HiveCollective!</w:t>
+        <w:t xml:space="preserve">Whenever you make changes locally, just run deploy.bat, type a commit message, and the live site updates automatically. Good luck with </w:t>
+      </w:r>
+      <w:proofErr w:type="spellStart"/>
+      <w:r>
+        <w:t>HiveCollective</w:t>
+      </w:r>
+      <w:proofErr w:type="spellEnd"/>
+      <w:r>
+        <w:t>!</w:t>
       </w:r>
     </w:p>
     <w:p/>
@@ -2033,6 +2109,85 @@
         <w:t>re_D3RQJAEE_Hf56BkcPEvqx4EXMQjm3KocL</w:t>
       </w:r>
     </w:p>
+    <w:p/>
+    <w:p>
+      <w:pPr>
+        <w:pStyle w:val="Heading1"/>
+      </w:pPr>
+      <w:r>
+        <w:t>Email confirmation</w:t>
+      </w:r>
+    </w:p>
+    <w:p>
+      <w:r>
+        <w:t>The backend is running the code correctly (registration returns 201, resend returns 200). The emails are just being silently dropped by Resend.</w:t>
+      </w:r>
+    </w:p>
+    <w:p>
+      <w:r>
+        <w:rPr>
+          <w:b/>
+          <w:bCs/>
+        </w:rPr>
+        <w:t>The reason:</w:t>
+      </w:r>
+      <w:r>
+        <w:t> </w:t>
+      </w:r>
+      <w:proofErr w:type="spellStart"/>
+      <w:r>
+        <w:t>Resend's</w:t>
+      </w:r>
+      <w:proofErr w:type="spellEnd"/>
+      <w:r>
+        <w:t xml:space="preserve"> free tier without a verified domain only delivers to the exact email you signed up to Resend with. Any other address gets silently rejected.</w:t>
+      </w:r>
+    </w:p>
+    <w:p>
+      <w:r>
+        <w:t>Two options:</w:t>
+      </w:r>
+    </w:p>
+    <w:p>
+      <w:r>
+        <w:rPr>
+          <w:b/>
+          <w:bCs/>
+        </w:rPr>
+        <w:t>Option 1 (quick test):</w:t>
+      </w:r>
+      <w:r>
+        <w:t> Delete the existing account with eagyeibo@gmail.com and re-register with that exact email — Resend will deliver to it since that's your account email.</w:t>
+      </w:r>
+    </w:p>
+    <w:p>
+      <w:r>
+        <w:rPr>
+          <w:b/>
+          <w:bCs/>
+        </w:rPr>
+        <w:t>Option 2 (permanent fix):</w:t>
+      </w:r>
+      <w:r>
+        <w:t> Verify a domain in Resend so you can send to anyone. Do you own a domain (like hivecollective.com or similar)?</w:t>
+      </w:r>
+    </w:p>
+    <w:p>
+      <w:proofErr w:type="gramStart"/>
+      <w:r>
+        <w:t>Lets</w:t>
+      </w:r>
+      <w:proofErr w:type="gramEnd"/>
+      <w:r>
+        <w:t xml:space="preserve"> put this feature on the back burner. We will come back to it later</w:t>
+      </w:r>
+    </w:p>
+    <w:p>
+      <w:r>
+        <w:t>Understood. The code is all built and working — it just needs domain verification in Resend to deliver to all users. We'll pick it up when you're ready.</w:t>
+      </w:r>
+    </w:p>
+    <w:p/>
     <w:sectPr>
       <w:pgSz w:w="12240" w:h="15840"/>
       <w:pgMar w:top="1440" w:right="1440" w:bottom="1440" w:left="1440" w:header="708" w:footer="708" w:gutter="0"/>
@@ -4323,7 +4478,6 @@
   <w:style w:type="character" w:default="1" w:styleId="DefaultParagraphFont">
     <w:name w:val="Default Paragraph Font"/>
     <w:uiPriority w:val="1"/>
-    <w:semiHidden/>
     <w:unhideWhenUsed/>
   </w:style>
   <w:style w:type="table" w:default="1" w:styleId="TableNormal">

</xml_diff>

<commit_message>
Login using Google account
</commit_message>
<xml_diff>
--- a/Missing features_April 17, 2026.docx
+++ b/Missing features_April 17, 2026.docx
@@ -2185,6 +2185,73 @@
     <w:p>
       <w:r>
         <w:t>Understood. The code is all built and working — it just needs domain verification in Resend to deliver to all users. We'll pick it up when you're ready.</w:t>
+      </w:r>
+    </w:p>
+    <w:p/>
+    <w:p>
+      <w:r>
+        <w:t>Setting up Railway Backend URI in Google</w:t>
+      </w:r>
+    </w:p>
+    <w:p>
+      <w:r>
+        <w:drawing>
+          <wp:inline distT="0" distB="0" distL="0" distR="0" wp14:anchorId="671D7F2D" wp14:editId="175DCD57">
+            <wp:extent cx="3701609" cy="4434021"/>
+            <wp:effectExtent l="0" t="0" r="0" b="5080"/>
+            <wp:docPr id="191612342" name="Picture 1"/>
+            <wp:cNvGraphicFramePr>
+              <a:graphicFrameLocks xmlns:a="http://schemas.openxmlformats.org/drawingml/2006/main" noChangeAspect="1"/>
+            </wp:cNvGraphicFramePr>
+            <a:graphic xmlns:a="http://schemas.openxmlformats.org/drawingml/2006/main">
+              <a:graphicData uri="http://schemas.openxmlformats.org/drawingml/2006/picture">
+                <pic:pic xmlns:pic="http://schemas.openxmlformats.org/drawingml/2006/picture">
+                  <pic:nvPicPr>
+                    <pic:cNvPr id="191612342" name=""/>
+                    <pic:cNvPicPr/>
+                  </pic:nvPicPr>
+                  <pic:blipFill>
+                    <a:blip r:embed="rId10"/>
+                    <a:stretch>
+                      <a:fillRect/>
+                    </a:stretch>
+                  </pic:blipFill>
+                  <pic:spPr>
+                    <a:xfrm>
+                      <a:off x="0" y="0"/>
+                      <a:ext cx="3711460" cy="4445821"/>
+                    </a:xfrm>
+                    <a:prstGeom prst="rect">
+                      <a:avLst/>
+                    </a:prstGeom>
+                  </pic:spPr>
+                </pic:pic>
+              </a:graphicData>
+            </a:graphic>
+          </wp:inline>
+        </w:drawing>
+      </w:r>
+      <w:r>
+        <w:t xml:space="preserve"> </w:t>
+      </w:r>
+    </w:p>
+    <w:p/>
+    <w:p/>
+    <w:p>
+      <w:r>
+        <w:t xml:space="preserve">Client ID: </w:t>
+      </w:r>
+      <w:r>
+        <w:t>401246975292-vat66mg5pm2g71ti49o5h4j7fiqnvkvp.apps.googleusercontent.com</w:t>
+      </w:r>
+    </w:p>
+    <w:p/>
+    <w:p>
+      <w:r>
+        <w:t xml:space="preserve">Client Secret: </w:t>
+      </w:r>
+      <w:r>
+        <w:t>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</w:t>
       </w:r>
     </w:p>
     <w:p/>

</xml_diff>

<commit_message>
Problem updates, Polls on solutions, solution co-authoring, Direct messaging
</commit_message>
<xml_diff>
--- a/Missing features_April 17, 2026.docx
+++ b/Missing features_April 17, 2026.docx
@@ -1074,27 +1074,46 @@
           <w:ilvl w:val="0"/>
           <w:numId w:val="3"/>
         </w:numPr>
+        <w:rPr>
+          <w:highlight w:val="green"/>
+        </w:rPr>
       </w:pPr>
       <w:r>
         <w:rPr>
           <w:b/>
           <w:bCs/>
+          <w:highlight w:val="green"/>
         </w:rPr>
         <w:t>Push notifications</w:t>
       </w:r>
       <w:r>
+        <w:rPr>
+          <w:highlight w:val="green"/>
+        </w:rPr>
         <w:t> — browser push for real-time alerts</w:t>
       </w:r>
       <w:r>
+        <w:rPr>
+          <w:highlight w:val="green"/>
+        </w:rPr>
         <w:t xml:space="preserve"> </w:t>
       </w:r>
       <w:r>
+        <w:rPr>
+          <w:highlight w:val="green"/>
+        </w:rPr>
         <w:sym w:font="Wingdings" w:char="F0E8"/>
       </w:r>
       <w:r>
+        <w:rPr>
+          <w:highlight w:val="green"/>
+        </w:rPr>
         <w:t xml:space="preserve"> </w:t>
       </w:r>
       <w:r>
+        <w:rPr>
+          <w:highlight w:val="green"/>
+        </w:rPr>
         <w:t>Done</w:t>
       </w:r>
     </w:p>
@@ -1122,27 +1141,46 @@
           <w:ilvl w:val="0"/>
           <w:numId w:val="3"/>
         </w:numPr>
+        <w:rPr>
+          <w:highlight w:val="green"/>
+        </w:rPr>
       </w:pPr>
       <w:r>
         <w:rPr>
           <w:b/>
           <w:bCs/>
+          <w:highlight w:val="green"/>
         </w:rPr>
         <w:t>Upvote notifications</w:t>
       </w:r>
       <w:r>
+        <w:rPr>
+          <w:highlight w:val="green"/>
+        </w:rPr>
         <w:t> — notify solution authors when their score changes significantly</w:t>
       </w:r>
       <w:r>
+        <w:rPr>
+          <w:highlight w:val="green"/>
+        </w:rPr>
         <w:t xml:space="preserve"> </w:t>
       </w:r>
       <w:r>
+        <w:rPr>
+          <w:highlight w:val="green"/>
+        </w:rPr>
         <w:sym w:font="Wingdings" w:char="F0E8"/>
       </w:r>
       <w:r>
+        <w:rPr>
+          <w:highlight w:val="green"/>
+        </w:rPr>
         <w:t xml:space="preserve"> </w:t>
       </w:r>
       <w:r>
+        <w:rPr>
+          <w:highlight w:val="green"/>
+        </w:rPr>
         <w:t>Done</w:t>
       </w:r>
     </w:p>
@@ -1226,15 +1264,22 @@
           <w:ilvl w:val="0"/>
           <w:numId w:val="4"/>
         </w:numPr>
+        <w:rPr>
+          <w:highlight w:val="green"/>
+        </w:rPr>
       </w:pPr>
       <w:r>
         <w:rPr>
           <w:b/>
           <w:bCs/>
+          <w:highlight w:val="green"/>
         </w:rPr>
         <w:t>Direct messaging</w:t>
       </w:r>
       <w:r>
+        <w:rPr>
+          <w:highlight w:val="green"/>
+        </w:rPr>
         <w:t> — private messages between users</w:t>
       </w:r>
     </w:p>
@@ -1262,15 +1307,22 @@
           <w:ilvl w:val="0"/>
           <w:numId w:val="4"/>
         </w:numPr>
+        <w:rPr>
+          <w:highlight w:val="green"/>
+        </w:rPr>
       </w:pPr>
       <w:r>
         <w:rPr>
           <w:b/>
           <w:bCs/>
+          <w:highlight w:val="green"/>
         </w:rPr>
         <w:t>Solution co-authoring</w:t>
       </w:r>
       <w:r>
+        <w:rPr>
+          <w:highlight w:val="green"/>
+        </w:rPr>
         <w:t> — multiple users credited on a single solution</w:t>
       </w:r>
     </w:p>
@@ -1280,15 +1332,22 @@
           <w:ilvl w:val="0"/>
           <w:numId w:val="4"/>
         </w:numPr>
+        <w:rPr>
+          <w:highlight w:val="green"/>
+        </w:rPr>
       </w:pPr>
       <w:r>
         <w:rPr>
           <w:b/>
           <w:bCs/>
+          <w:highlight w:val="green"/>
         </w:rPr>
         <w:t>Problem updates / progress posts</w:t>
       </w:r>
       <w:r>
+        <w:rPr>
+          <w:highlight w:val="green"/>
+        </w:rPr>
         <w:t> — problem owners post status updates over time</w:t>
       </w:r>
     </w:p>
@@ -1298,15 +1357,22 @@
           <w:ilvl w:val="0"/>
           <w:numId w:val="4"/>
         </w:numPr>
+        <w:rPr>
+          <w:highlight w:val="green"/>
+        </w:rPr>
       </w:pPr>
       <w:r>
         <w:rPr>
           <w:b/>
           <w:bCs/>
+          <w:highlight w:val="green"/>
         </w:rPr>
         <w:t>Polls on solutions</w:t>
       </w:r>
       <w:r>
+        <w:rPr>
+          <w:highlight w:val="green"/>
+        </w:rPr>
         <w:t> — community votes on which direction to take</w:t>
       </w:r>
     </w:p>

</xml_diff>

<commit_message>
Impact metrics — 20 minutes, just adds a field to problems
</commit_message>
<xml_diff>
--- a/Missing features_April 17, 2026.docx
+++ b/Missing features_April 17, 2026.docx
@@ -832,15 +832,22 @@
           <w:ilvl w:val="0"/>
           <w:numId w:val="1"/>
         </w:numPr>
+        <w:rPr>
+          <w:highlight w:val="green"/>
+        </w:rPr>
       </w:pPr>
       <w:r>
         <w:rPr>
           <w:b/>
           <w:bCs/>
+          <w:highlight w:val="green"/>
         </w:rPr>
         <w:t>Password reset via email</w:t>
       </w:r>
       <w:r>
+        <w:rPr>
+          <w:highlight w:val="green"/>
+        </w:rPr>
         <w:t> — forgot password flow with token (SendGrid/Resend)</w:t>
       </w:r>
     </w:p>
@@ -850,16 +857,23 @@
           <w:ilvl w:val="0"/>
           <w:numId w:val="1"/>
         </w:numPr>
+        <w:rPr>
+          <w:highlight w:val="green"/>
+        </w:rPr>
       </w:pPr>
       <w:r>
         <w:rPr>
           <w:b/>
           <w:bCs/>
+          <w:highlight w:val="green"/>
         </w:rPr>
         <w:lastRenderedPageBreak/>
         <w:t>Email verification</w:t>
       </w:r>
       <w:r>
+        <w:rPr>
+          <w:highlight w:val="green"/>
+        </w:rPr>
         <w:t> — confirm email on signup</w:t>
       </w:r>
     </w:p>
@@ -874,11 +888,21 @@
         <w:rPr>
           <w:b/>
           <w:bCs/>
+          <w:highlight w:val="green"/>
         </w:rPr>
         <w:t>OAuth login</w:t>
       </w:r>
       <w:r>
-        <w:t> — Sign in with Google / GitHub</w:t>
+        <w:rPr>
+          <w:highlight w:val="green"/>
+        </w:rPr>
+        <w:t> — Sign in with Google</w:t>
+      </w:r>
+      <w:r>
+        <w:t xml:space="preserve"> / GitHub</w:t>
+      </w:r>
+      <w:r>
+        <w:t xml:space="preserve"> (not implemented)</w:t>
       </w:r>
     </w:p>
     <w:p>
@@ -1134,6 +1158,15 @@
       <w:r>
         <w:t> — weekly summary of activity in your groups and bookmarks</w:t>
       </w:r>
+      <w:r>
+        <w:rPr>
+          <w:rFonts w:ascii="Segoe UI" w:hAnsi="Segoe UI" w:cs="Segoe UI"/>
+          <w:color w:val="EE0000"/>
+          <w:sz w:val="20"/>
+          <w:szCs w:val="20"/>
+        </w:rPr>
+        <w:t>— park until domain is verified</w:t>
+      </w:r>
     </w:p>
     <w:p>
       <w:pPr>
@@ -1185,62 +1218,6 @@
       </w:r>
     </w:p>
     <w:p>
-      <w:pPr>
-        <w:ind w:left="720"/>
-      </w:pPr>
-    </w:p>
-    <w:p>
-      <w:pPr>
-        <w:pStyle w:val="mb-var--p5"/>
-        <w:numPr>
-          <w:ilvl w:val="0"/>
-          <w:numId w:val="3"/>
-        </w:numPr>
-        <w:pBdr>
-          <w:top w:val="single" w:sz="2" w:space="0" w:color="E2E1DA"/>
-          <w:left w:val="single" w:sz="2" w:space="15" w:color="E2E1DA"/>
-          <w:bottom w:val="single" w:sz="2" w:space="0" w:color="E2E1DA"/>
-          <w:right w:val="single" w:sz="2" w:space="0" w:color="E2E1DA"/>
-        </w:pBdr>
-        <w:shd w:val="clear" w:color="auto" w:fill="0D0D0D"/>
-        <w:spacing w:after="90" w:afterAutospacing="0" w:line="285" w:lineRule="atLeast"/>
-        <w:rPr>
-          <w:rFonts w:ascii="Segoe UI" w:hAnsi="Segoe UI" w:cs="Segoe UI"/>
-          <w:color w:val="E2E1DA"/>
-          <w:sz w:val="20"/>
-          <w:szCs w:val="20"/>
-        </w:rPr>
-      </w:pPr>
-      <w:r>
-        <w:rPr>
-          <w:rStyle w:val="Strong"/>
-          <w:rFonts w:ascii="Segoe UI" w:eastAsiaTheme="majorEastAsia" w:hAnsi="Segoe UI" w:cs="Segoe UI"/>
-          <w:color w:val="E2E1DA"/>
-          <w:sz w:val="20"/>
-          <w:szCs w:val="20"/>
-          <w:bdr w:val="single" w:sz="2" w:space="0" w:color="E2E1DA" w:frame="1"/>
-        </w:rPr>
-        <w:t>Digest emails</w:t>
-      </w:r>
-      <w:r>
-        <w:rPr>
-          <w:rFonts w:ascii="Segoe UI" w:hAnsi="Segoe UI" w:cs="Segoe UI"/>
-          <w:color w:val="E2E1DA"/>
-          <w:sz w:val="20"/>
-          <w:szCs w:val="20"/>
-        </w:rPr>
-        <w:t> — park until domain is verified</w:t>
-      </w:r>
-    </w:p>
-    <w:p>
-      <w:pPr>
-        <w:numPr>
-          <w:ilvl w:val="0"/>
-          <w:numId w:val="3"/>
-        </w:numPr>
-      </w:pPr>
-    </w:p>
-    <w:p>
       <w:r>
         <w:pict w14:anchorId="3948E574">
           <v:rect id="_x0000_i1028" style="width:0;height:0" o:hralign="center" o:hrstd="t" o:hr="t" fillcolor="#a0a0a0" stroked="f"/>
@@ -1406,7 +1383,6 @@
           <w:b/>
           <w:bCs/>
         </w:rPr>
-        <w:lastRenderedPageBreak/>
         <w:t>Public SEO pages</w:t>
       </w:r>
       <w:r>
@@ -1419,11 +1395,15 @@
           <w:ilvl w:val="0"/>
           <w:numId w:val="5"/>
         </w:numPr>
+        <w:rPr>
+          <w:highlight w:val="green"/>
+        </w:rPr>
       </w:pPr>
       <w:r>
         <w:rPr>
           <w:b/>
           <w:bCs/>
+          <w:highlight w:val="green"/>
         </w:rPr>
         <w:t xml:space="preserve">Shareable </w:t>
       </w:r>
@@ -1432,6 +1412,7 @@
         <w:rPr>
           <w:b/>
           <w:bCs/>
+          <w:highlight w:val="green"/>
         </w:rPr>
         <w:t>embed</w:t>
       </w:r>
@@ -1440,18 +1421,28 @@
         <w:rPr>
           <w:b/>
           <w:bCs/>
+          <w:highlight w:val="green"/>
         </w:rPr>
         <w:t xml:space="preserve"> cards</w:t>
       </w:r>
       <w:r>
+        <w:rPr>
+          <w:highlight w:val="green"/>
+        </w:rPr>
         <w:t xml:space="preserve"> — </w:t>
       </w:r>
       <w:proofErr w:type="spellStart"/>
       <w:r>
+        <w:rPr>
+          <w:highlight w:val="green"/>
+        </w:rPr>
         <w:t>OpenGraph</w:t>
       </w:r>
       <w:proofErr w:type="spellEnd"/>
       <w:r>
+        <w:rPr>
+          <w:highlight w:val="green"/>
+        </w:rPr>
         <w:t xml:space="preserve"> cards so links look good on WhatsApp/Twitter</w:t>
       </w:r>
     </w:p>
@@ -1461,15 +1452,23 @@
           <w:ilvl w:val="0"/>
           <w:numId w:val="5"/>
         </w:numPr>
+        <w:rPr>
+          <w:highlight w:val="green"/>
+        </w:rPr>
       </w:pPr>
       <w:r>
         <w:rPr>
           <w:b/>
           <w:bCs/>
-        </w:rPr>
+          <w:highlight w:val="green"/>
+        </w:rPr>
+        <w:lastRenderedPageBreak/>
         <w:t>Related problems</w:t>
       </w:r>
       <w:r>
+        <w:rPr>
+          <w:highlight w:val="green"/>
+        </w:rPr>
         <w:t> — "You might also care about…" suggestions based on tags/location</w:t>
       </w:r>
     </w:p>
@@ -1479,15 +1478,22 @@
           <w:ilvl w:val="0"/>
           <w:numId w:val="5"/>
         </w:numPr>
+        <w:rPr>
+          <w:highlight w:val="green"/>
+        </w:rPr>
       </w:pPr>
       <w:r>
         <w:rPr>
           <w:b/>
           <w:bCs/>
+          <w:highlight w:val="green"/>
         </w:rPr>
         <w:t>Verified organisations</w:t>
       </w:r>
       <w:r>
+        <w:rPr>
+          <w:highlight w:val="green"/>
+        </w:rPr>
         <w:t> — NGOs, governments, companies get a verified badge</w:t>
       </w:r>
     </w:p>
@@ -1833,6 +1839,7 @@
         <w:rPr>
           <w:noProof/>
         </w:rPr>
+        <w:lastRenderedPageBreak/>
         <w:drawing>
           <wp:inline distT="0" distB="0" distL="0" distR="0" wp14:anchorId="1697364B" wp14:editId="0546BD20">
             <wp:extent cx="5943600" cy="3943350"/>

</xml_diff>